<commit_message>
V9.1: recalibrate contribution hierarchy per author
- Zero-failure design restated as a supporting, observation-driven
  element enabled by cheap AI-assisted iteration - not a core
  contribution (2.6.2C)
- Adaptive learning stated as the programme's principal design
  discovery: the behavioural-change driver, with decoupling and
  zero-failure as supporting components and LODF as its engineering
  formalisation (2.8 step five)

Co-Authored-By: Claude Fable 5 <noreply@anthropic.com>
Claude-Session: https://claude.ai/code/session_01KoT3i8geZspYBMMKVYJUTG
</commit_message>
<xml_diff>
--- a/docs/thesis/Tam_V9_EngD_Thesis_Final_Revision_Draft.docx
+++ b/docs/thesis/Tam_V9_EngD_Thesis_Final_Revision_Draft.docx
@@ -6731,12 +6731,12 @@
     </w:p>
     <w:p>
       <w:r>
-        <w:t>Zero-failure design is the one theoretical element of this thesis that was not found in the literature but generated from its field observations, and it deserves to be stated as such. The concept is simple: in a clinically framed activity for older adults, the game must contain no terminal failure verdict. There is no Game Over screen, no lives-exhausted ending and no fail-state label; a collision or an error becomes an input to adaptation — the environment eases, the run continues — while challenge and truthful performance feedback are preserved. Zero-failure design is not challenge-free design (the desirable-difficulty literature of §2.6.2A warns against that) and it is not concealment (§8.7.2): it removes verdicts, not information.</w:t>
-      </w:r>
-    </w:p>
-    <w:p>
-      <w:r>
-        <w:t>The concept inverts the eighth Octalysis drive. Chou (2015) treats Loss and Avoidance as a motivational lever the designer should use: fear of losing progress, streaks or assets keeps players playing. The observations of this programme point the other way for older users in clinical frames. The loss that governs their behaviour is not the in-game loss the framework manipulates; it is an identity-level loss — the threatened revaluation of a valued self-description — that sits entirely outside the game's ledger (§2.5.3). Where the framework says amplify loss salience to drive engagement, zero-failure design says remove loss presentation because the player is already carrying a loss the designer cannot see. To the author's knowledge, no elderly-gamification study states this inversion; it is offered as a contribution of the research observation, not of the literature.</w:t>
+        <w:t>Zero-failure design is a supporting design element of this thesis, not a core contribution. It was not found in the literature; it emerged from the field observations, and it became practical to build and test only because AI-assisted development made game-mechanic iteration cheap (§5.3.9). It is stated here because it disrupts an assumption of the framework this chapter reviews, and because the thesis's central design proposition — adaptive learning (§2.6.2A–B) — subsumes it. The concept is simple: in a clinically framed activity for older adults, the game must contain no terminal failure verdict. There is no Game Over screen, no lives-exhausted ending and no fail-state label; a collision or an error becomes an input to adaptation — the environment eases, the run continues — while challenge and truthful performance feedback are preserved. Zero-failure design is not challenge-free design (the desirable-difficulty literature of §2.6.2A warns against that) and it is not concealment (§8.7.2): it removes verdicts, not information.</w:t>
+      </w:r>
+    </w:p>
+    <w:p>
+      <w:r>
+        <w:t>The concept inverts the eighth Octalysis drive. Chou (2015) treats Loss and Avoidance as a motivational lever the designer should use: fear of losing progress, streaks or assets keeps players playing. The observations of this programme point the other way for older users in clinical frames. The loss that governs their behaviour is not the in-game loss the framework manipulates; it is an identity-level loss — the threatened revaluation of a valued self-description — that sits entirely outside the game's ledger (§2.5.3). Where the framework says amplify loss salience to drive engagement, zero-failure design says remove loss presentation because the player is already carrying a loss the designer cannot see. To the author's knowledge, no elderly-gamification study states this inversion. It is recorded as an observation-driven design element in support of the thesis's central design proposition, adaptive learning, rather than as a headline contribution in its own right.</w:t>
       </w:r>
     </w:p>
     <w:p>
@@ -6894,7 +6894,7 @@
         <w:jc w:val="both"/>
       </w:pPr>
       <w:r>
-        <w:t>The argument of this chapter can now be read in five plain steps. Step one: the acceptance literature says that fitting a technology to the user's acceptance criteria produces intention and use, and the gamification literature says game mechanics amplify this for older adults — together they yield the null hypothesis H0 of §2.3.5, that a well-made gamified FRA will be accepted and used, and that failure will not drive abandonment. Step two: the data reject H0 — retrospectively in Stage 1 (Chapter 4) and prospectively in Stage 2 (Chapter 5), where seventy per cent of participants disengaged early and none returned, despite an AI-assisted build that satisfied the stack's design criteria. Step three: self-efficacy explains the dropout but not its permanence, and not the improvement/non-return paradox. Step four: the behavioural-economics account structured in Table 2.1 — loss aversion, identity-relevant endowment, mental accounting, stereotype threat — explains precisely the observations H0 cannot, and is named FIAS. Step five: the account implies three design responses — zero-failure presentation, the research-generated inversion of Octalysis D8 (§2.6.2C); participant-facing decoupling, for which Stage 3 (Chapter 6) provides between-cohort field evidence; and learning-oriented adaptation (LODF, Chapter 7), which binds both into a framework that awaits prospective testing.</w:t>
+        <w:t>The argument of this chapter can now be read in five plain steps. Step one: the acceptance literature says that fitting a technology to the user's acceptance criteria produces intention and use, and the gamification literature says game mechanics amplify this for older adults — together they yield the null hypothesis H0 of §2.3.5, that a well-made gamified FRA will be accepted and used, and that failure will not drive abandonment. Step two: the data reject H0 — retrospectively in Stage 1 (Chapter 4) and prospectively in Stage 2 (Chapter 5), where seventy per cent of participants disengaged early and none returned, despite an AI-assisted build that satisfied the stack's design criteria. Step three: self-efficacy explains the dropout but not its permanence, and not the improvement/non-return paradox. Step four: the behavioural-economics account structured in Table 2.1 — loss aversion, identity-relevant endowment, mental accounting, stereotype threat — explains precisely the observations H0 cannot, and is named FIAS. Step five: the account implies a design response whose centre is adaptive learning — challenge calibrated to the individual and failure reframed as information about a personal trajectory (§2.6.2A–B) — the behavioural-change driver this programme regards as its principal design discovery. Two components support it: participant-facing decoupling, for which Stage 3 (Chapter 6) provides between-cohort field evidence, and zero-failure presentation, the observation-driven inversion of Octalysis D8 (§2.6.2C). LODF (Chapter 7) is the engineering formalisation of the adaptive-learning proposition, and it awaits prospective testing.</w:t>
       </w:r>
     </w:p>
     <w:p>

</xml_diff>